<commit_message>
feat(cv): réécrit la conclusion « À propos de moi » et ajoute Product Owner
Les deux derniers paragraphes du bloc « À propos de moi » fusionnent
avec le nouveau texte : 100 % du code passe par une orchestration
d'agents d'IA depuis un an, puis une conclusion qui s'adresse au lecteur
(« Si vous envisagez, vous aussi… »). Même texte sur le CV et le DCI.

DCI : « Product Owner » ajouté au poste recherché.

Exports régénérés : PDF du CV (4 pages) et du DCI (20 pages) par Chrome
headless ; Word du DCI corrigé directement dans son XML, ligne des
technologies comprise. Rendu des PDF et du Word non relu visuellement.

Co-Authored-By: Claude Opus 5.5 (1M context) <noreply@anthropic.com>
</commit_message>
<xml_diff>
--- a/Johan-REMY-DCI.docx
+++ b/Johan-REMY-DCI.docx
@@ -93,7 +93,7 @@
           <w:sz w:val="18"/>
           <w:szCs w:val="18"/>
         </w:rPr>
-        <w:t xml:space="preserve">Symfony · Nuxt · Python · API Platform</w:t>
+        <w:t xml:space="preserve">PHP · Symfony · Vue · Nuxt · Python · API Platform · Docker</w:t>
       </w:r>
     </w:p>
     <w:p>
@@ -192,7 +192,7 @@
                 <w:sz w:val="20"/>
                 <w:szCs w:val="20"/>
               </w:rPr>
-              <w:t xml:space="preserve">Lead développeur · Tech Lead · Chef de projet digital</w:t>
+              <w:t xml:space="preserve">Lead développeur · Tech Lead · Chef de projet digital · Product Owner</w:t>
             </w:r>
           </w:p>
         </w:tc>
@@ -650,68 +650,68 @@
           <w:sz w:val="20"/>
           <w:szCs w:val="20"/>
         </w:rPr>
-        <w:t xml:space="preserve">Aujourd’hui, j’</w:t>
-      </w:r>
-      <w:r>
-        <w:rPr>
-          <w:rFonts w:ascii="Arial" w:cs="Arial" w:eastAsia="Arial" w:hAnsi="Arial"/>
-          <w:b/>
-          <w:bCs/>
-          <w:i w:val="false"/>
-          <w:iCs w:val="false"/>
-          <w:color w:val="212121"/>
-          <w:sz w:val="20"/>
-          <w:szCs w:val="20"/>
-        </w:rPr>
-        <w:t xml:space="preserve">orchestre plusieurs agents IA</w:t>
-      </w:r>
-      <w:r>
-        <w:rPr>
-          <w:rFonts w:ascii="Arial" w:cs="Arial" w:eastAsia="Arial" w:hAnsi="Arial"/>
-          <w:i w:val="false"/>
-          <w:iCs w:val="false"/>
-          <w:color w:val="212121"/>
-          <w:sz w:val="20"/>
-          <w:szCs w:val="20"/>
-        </w:rPr>
-        <w:t xml:space="preserve"> selon mon propre workflow : concevoir, développer, consolider. Je garde la main sur </w:t>
-      </w:r>
-      <w:r>
-        <w:rPr>
-          <w:rFonts w:ascii="Arial" w:cs="Arial" w:eastAsia="Arial" w:hAnsi="Arial"/>
-          <w:b/>
-          <w:bCs/>
-          <w:i w:val="false"/>
-          <w:iCs w:val="false"/>
-          <w:color w:val="212121"/>
-          <w:sz w:val="20"/>
-          <w:szCs w:val="20"/>
-        </w:rPr>
-        <w:t xml:space="preserve">le cadrage, l’architecture et la validation</w:t>
-      </w:r>
-      <w:r>
-        <w:rPr>
-          <w:rFonts w:ascii="Arial" w:cs="Arial" w:eastAsia="Arial" w:hAnsi="Arial"/>
-          <w:i w:val="false"/>
-          <w:iCs w:val="false"/>
-          <w:color w:val="212121"/>
-          <w:sz w:val="20"/>
-          <w:szCs w:val="20"/>
-        </w:rPr>
-        <w:t xml:space="preserve">. Mes sessions de consolidation transforment les bonnes pratiques en conventions techniques et en </w:t>
-      </w:r>
-      <w:r>
-        <w:rPr>
-          <w:rFonts w:ascii="Arial" w:cs="Arial" w:eastAsia="Arial" w:hAnsi="Arial"/>
-          <w:b/>
-          <w:bCs/>
-          <w:i w:val="false"/>
-          <w:iCs w:val="false"/>
-          <w:color w:val="212121"/>
-          <w:sz w:val="20"/>
-          <w:szCs w:val="20"/>
-        </w:rPr>
-        <w:t xml:space="preserve">garde-fous automatisés dans la CI/CD</w:t>
+        <w:t xml:space="preserve">Depuis un an, </w:t>
+      </w:r>
+      <w:r>
+        <w:rPr>
+          <w:rFonts w:ascii="Arial" w:cs="Arial" w:eastAsia="Arial" w:hAnsi="Arial"/>
+          <w:b/>
+          <w:bCs/>
+          <w:i w:val="false"/>
+          <w:iCs w:val="false"/>
+          <w:color w:val="212121"/>
+          <w:sz w:val="20"/>
+          <w:szCs w:val="20"/>
+        </w:rPr>
+        <w:t xml:space="preserve">100 % de mon code passe par une orchestration d’agents d’IA</w:t>
+      </w:r>
+      <w:r>
+        <w:rPr>
+          <w:rFonts w:ascii="Arial" w:cs="Arial" w:eastAsia="Arial" w:hAnsi="Arial"/>
+          <w:i w:val="false"/>
+          <w:iCs w:val="false"/>
+          <w:color w:val="212121"/>
+          <w:sz w:val="20"/>
+          <w:szCs w:val="20"/>
+        </w:rPr>
+        <w:t xml:space="preserve">, selon mon propre workflow : concevoir, développer, consolider. Je garde la main sur </w:t>
+      </w:r>
+      <w:r>
+        <w:rPr>
+          <w:rFonts w:ascii="Arial" w:cs="Arial" w:eastAsia="Arial" w:hAnsi="Arial"/>
+          <w:b/>
+          <w:bCs/>
+          <w:i w:val="false"/>
+          <w:iCs w:val="false"/>
+          <w:color w:val="212121"/>
+          <w:sz w:val="20"/>
+          <w:szCs w:val="20"/>
+        </w:rPr>
+        <w:t xml:space="preserve">le cadrage, l’architecture et la revue</w:t>
+      </w:r>
+      <w:r>
+        <w:rPr>
+          <w:rFonts w:ascii="Arial" w:cs="Arial" w:eastAsia="Arial" w:hAnsi="Arial"/>
+          <w:i w:val="false"/>
+          <w:iCs w:val="false"/>
+          <w:color w:val="212121"/>
+          <w:sz w:val="20"/>
+          <w:szCs w:val="20"/>
+        </w:rPr>
+        <w:t xml:space="preserve">, et mes sessions de consolidation transforment les bonnes pratiques en conventions techniques et en </w:t>
+      </w:r>
+      <w:r>
+        <w:rPr>
+          <w:rFonts w:ascii="Arial" w:cs="Arial" w:eastAsia="Arial" w:hAnsi="Arial"/>
+          <w:b/>
+          <w:bCs/>
+          <w:i w:val="false"/>
+          <w:iCs w:val="false"/>
+          <w:color w:val="212121"/>
+          <w:sz w:val="20"/>
+          <w:szCs w:val="20"/>
+        </w:rPr>
+        <w:t xml:space="preserve">garde-fous automatisés dans l’intégration continue</w:t>
       </w:r>
       <w:r>
         <w:rPr>
@@ -739,44 +739,44 @@
           <w:sz w:val="20"/>
           <w:szCs w:val="20"/>
         </w:rPr>
-        <w:t xml:space="preserve">Je souhaite mettre cette expérience au service d’équipes qui adoptent </w:t>
-      </w:r>
-      <w:r>
-        <w:rPr>
-          <w:rFonts w:ascii="Arial" w:cs="Arial" w:eastAsia="Arial" w:hAnsi="Arial"/>
-          <w:b/>
-          <w:bCs/>
-          <w:i w:val="false"/>
-          <w:iCs w:val="false"/>
-          <w:color w:val="212121"/>
-          <w:sz w:val="20"/>
-          <w:szCs w:val="20"/>
-        </w:rPr>
-        <w:t xml:space="preserve">le développement assisté par l’IA</w:t>
-      </w:r>
-      <w:r>
-        <w:rPr>
-          <w:rFonts w:ascii="Arial" w:cs="Arial" w:eastAsia="Arial" w:hAnsi="Arial"/>
-          <w:i w:val="false"/>
-          <w:iCs w:val="false"/>
-          <w:color w:val="212121"/>
-          <w:sz w:val="20"/>
-          <w:szCs w:val="20"/>
-        </w:rPr>
-        <w:t xml:space="preserve">, jusqu’à la génération complète du code, </w:t>
-      </w:r>
-      <w:r>
-        <w:rPr>
-          <w:rFonts w:ascii="Arial" w:cs="Arial" w:eastAsia="Arial" w:hAnsi="Arial"/>
-          <w:b/>
-          <w:bCs/>
-          <w:i w:val="false"/>
-          <w:iCs w:val="false"/>
-          <w:color w:val="212121"/>
-          <w:sz w:val="20"/>
-          <w:szCs w:val="20"/>
-        </w:rPr>
-        <w:t xml:space="preserve">sous contrôle humain de l’architecture et de la qualité</w:t>
+        <w:t xml:space="preserve">Si vous envisagez, vous aussi, de faire de </w:t>
+      </w:r>
+      <w:r>
+        <w:rPr>
+          <w:rFonts w:ascii="Arial" w:cs="Arial" w:eastAsia="Arial" w:hAnsi="Arial"/>
+          <w:b/>
+          <w:bCs/>
+          <w:i w:val="false"/>
+          <w:iCs w:val="false"/>
+          <w:color w:val="212121"/>
+          <w:sz w:val="20"/>
+          <w:szCs w:val="20"/>
+        </w:rPr>
+        <w:t xml:space="preserve">l’IA un vrai levier de production</w:t>
+      </w:r>
+      <w:r>
+        <w:rPr>
+          <w:rFonts w:ascii="Arial" w:cs="Arial" w:eastAsia="Arial" w:hAnsi="Arial"/>
+          <w:i w:val="false"/>
+          <w:iCs w:val="false"/>
+          <w:color w:val="212121"/>
+          <w:sz w:val="20"/>
+          <w:szCs w:val="20"/>
+        </w:rPr>
+        <w:t xml:space="preserve">, je serais très intéressé de vous accompagner sur ce chemin, </w:t>
+      </w:r>
+      <w:r>
+        <w:rPr>
+          <w:rFonts w:ascii="Arial" w:cs="Arial" w:eastAsia="Arial" w:hAnsi="Arial"/>
+          <w:b/>
+          <w:bCs/>
+          <w:i w:val="false"/>
+          <w:iCs w:val="false"/>
+          <w:color w:val="212121"/>
+          <w:sz w:val="20"/>
+          <w:szCs w:val="20"/>
+        </w:rPr>
+        <w:t xml:space="preserve">sans rien céder sur la qualité du code livré</w:t>
       </w:r>
       <w:r>
         <w:rPr>

</xml_diff>

<commit_message>
feat(cv): actualise le titre et la présentation du CV et du DCI — task TASK-002
</commit_message>
<xml_diff>
--- a/Johan-REMY-DCI.docx
+++ b/Johan-REMY-DCI.docx
@@ -1,6 +1,6 @@
 
 <file path=word/document.xml><?xml version="1.0" encoding="utf-8"?>
-<w:document xmlns:wpc="http://schemas.microsoft.com/office/word/2010/wordprocessingCanvas" xmlns:mc="http://schemas.openxmlformats.org/markup-compatibility/2006" xmlns:o="urn:schemas-microsoft-com:office:office" xmlns:r="http://schemas.openxmlformats.org/officeDocument/2006/relationships" xmlns:m="http://schemas.openxmlformats.org/officeDocument/2006/math" xmlns:v="urn:schemas-microsoft-com:vml" xmlns:wp14="http://schemas.microsoft.com/office/word/2010/wordprocessingDrawing" xmlns:wp="http://schemas.openxmlformats.org/drawingml/2006/wordprocessingDrawing" xmlns:w10="urn:schemas-microsoft-com:office:word" xmlns:w="http://schemas.openxmlformats.org/wordprocessingml/2006/main" xmlns:w14="http://schemas.microsoft.com/office/word/2010/wordml" xmlns:w15="http://schemas.microsoft.com/office/word/2012/wordml" xmlns:wpg="http://schemas.microsoft.com/office/word/2010/wordprocessingGroup" xmlns:wpi="http://schemas.microsoft.com/office/word/2010/wordprocessingInk" xmlns:wne="http://schemas.microsoft.com/office/word/2006/wordml" xmlns:wps="http://schemas.microsoft.com/office/word/2010/wordprocessingShape" xmlns:cx="http://schemas.microsoft.com/office/drawing/2014/chartex" xmlns:cx1="http://schemas.microsoft.com/office/drawing/2015/9/8/chartex" xmlns:cx2="http://schemas.microsoft.com/office/drawing/2015/10/21/chartex" xmlns:cx3="http://schemas.microsoft.com/office/drawing/2016/5/9/chartex" xmlns:cx4="http://schemas.microsoft.com/office/drawing/2016/5/10/chartex" xmlns:cx5="http://schemas.microsoft.com/office/drawing/2016/5/11/chartex" xmlns:cx6="http://schemas.microsoft.com/office/drawing/2016/5/12/chartex" xmlns:cx7="http://schemas.microsoft.com/office/drawing/2016/5/13/chartex" xmlns:cx8="http://schemas.microsoft.com/office/drawing/2016/5/14/chartex" xmlns:aink="http://schemas.microsoft.com/office/drawing/2016/ink" xmlns:am3d="http://schemas.microsoft.com/office/drawing/2017/model3d" xmlns:w16cex="http://schemas.microsoft.com/office/word/2018/wordml/cex" xmlns:w16cid="http://schemas.microsoft.com/office/word/2016/wordml/cid" xmlns:w16="http://schemas.microsoft.com/office/word/2018/wordml" xmlns:w16sdtdh="http://schemas.microsoft.com/office/word/2020/wordml/sdtdatahash" xmlns:w16se="http://schemas.microsoft.com/office/word/2015/wordml/symex" mc:Ignorable="w14 w15 wp14">
+<w:document xmlns:ns1="http://schemas.openxmlformats.org/markup-compatibility/2006" xmlns:ns2="http://schemas.openxmlformats.org/officeDocument/2006/relationships" xmlns:w="http://schemas.openxmlformats.org/wordprocessingml/2006/main" ns1:Ignorable="w14 w15 wp14">
   <w:body>
     <w:p>
       <w:pPr>
@@ -46,35 +46,49 @@
           <w:sz w:val="26"/>
           <w:szCs w:val="26"/>
         </w:rPr>
-        <w:t xml:space="preserve">Senior Développeur Full Stack</w:t>
-      </w:r>
-    </w:p>
-    <w:p>
-      <w:pPr>
-        <w:spacing w:after="20"/>
-      </w:pPr>
-      <w:r>
-        <w:rPr>
-          <w:rFonts w:ascii="Arial" w:cs="Arial" w:eastAsia="Arial" w:hAnsi="Arial"/>
-          <w:color w:val="212121"/>
-          <w:sz w:val="26"/>
-          <w:szCs w:val="26"/>
-        </w:rPr>
-        <w:t xml:space="preserve">Agents IA · Orchestration · Génération</w:t>
-      </w:r>
-    </w:p>
-    <w:p>
-      <w:pPr>
-        <w:spacing w:after="20"/>
-      </w:pPr>
-      <w:r>
-        <w:rPr>
-          <w:rFonts w:ascii="Arial" w:cs="Arial" w:eastAsia="Arial" w:hAnsi="Arial"/>
-          <w:color w:val="212121"/>
-          <w:sz w:val="26"/>
-          <w:szCs w:val="26"/>
-        </w:rPr>
-        <w:t xml:space="preserve">Architecture · Refonte · Lead</w:t>
+        <w:t xml:space="preserve">Développeur Full Stack senior</w:t>
+      </w:r>
+    </w:p>
+    <w:p>
+      <w:pPr>
+        <w:spacing w:after="0" w:line="336" w:lineRule="auto"/>
+      </w:pPr>
+      <w:r>
+        <w:rPr>
+          <w:rFonts w:ascii="Inter" w:cs="Inter" w:eastAsia="Inter" w:hAnsi="Inter"/>
+          <w:color w:val="212121"/>
+          <w:sz w:val="20"/>
+          <w:szCs w:val="20"/>
+        </w:rPr>
+        <w:t xml:space="preserve">Applications web, SaaS &amp; outils métier sur mesure</w:t>
+      </w:r>
+    </w:p>
+    <w:p>
+      <w:pPr>
+        <w:spacing w:after="0" w:line="336" w:lineRule="auto"/>
+      </w:pPr>
+      <w:r>
+        <w:rPr>
+          <w:rFonts w:ascii="Inter" w:cs="Inter" w:eastAsia="Inter" w:hAnsi="Inter"/>
+          <w:color w:val="212121"/>
+          <w:sz w:val="20"/>
+          <w:szCs w:val="20"/>
+        </w:rPr>
+        <w:t xml:space="preserve">Architecture, reprise &amp; refonte · API &amp; automatisations</w:t>
+      </w:r>
+    </w:p>
+    <w:p>
+      <w:pPr>
+        <w:spacing w:after="0" w:line="336" w:lineRule="auto"/>
+      </w:pPr>
+      <w:r>
+        <w:rPr>
+          <w:rFonts w:ascii="Inter" w:cs="Inter" w:eastAsia="Inter" w:hAnsi="Inter"/>
+          <w:color w:val="212121"/>
+          <w:sz w:val="20"/>
+          <w:szCs w:val="20"/>
+        </w:rPr>
+        <w:t xml:space="preserve">Agents IA &amp; orchestration multi-agents · Lead technique</w:t>
       </w:r>
     </w:p>
     <w:p>
@@ -294,55 +308,151 @@
           <w:sz w:val="20"/>
           <w:szCs w:val="20"/>
         </w:rPr>
-        <w:t xml:space="preserve">Originaire de Marseille, je suis récemment revenu en France. J’ai </w:t>
-      </w:r>
-      <w:r>
-        <w:rPr>
-          <w:rFonts w:ascii="Arial" w:cs="Arial" w:eastAsia="Arial" w:hAnsi="Arial"/>
-          <w:b/>
-          <w:bCs/>
-          <w:i w:val="false"/>
-          <w:iCs w:val="false"/>
-          <w:color w:val="212121"/>
-          <w:sz w:val="20"/>
-          <w:szCs w:val="20"/>
-        </w:rPr>
-        <w:t xml:space="preserve">plus de quinze ans d’expérience en développement web</w:t>
-      </w:r>
-      <w:r>
-        <w:rPr>
-          <w:rFonts w:ascii="Arial" w:cs="Arial" w:eastAsia="Arial" w:hAnsi="Arial"/>
-          <w:i w:val="false"/>
-          <w:iCs w:val="false"/>
-          <w:color w:val="212121"/>
-          <w:sz w:val="20"/>
-          <w:szCs w:val="20"/>
-        </w:rPr>
-        <w:t xml:space="preserve"> : six ans en France, puis neuf ans et demi au Maroc, dont </w:t>
-      </w:r>
-      <w:r>
-        <w:rPr>
-          <w:rFonts w:ascii="Arial" w:cs="Arial" w:eastAsia="Arial" w:hAnsi="Arial"/>
-          <w:b/>
-          <w:bCs/>
-          <w:i w:val="false"/>
-          <w:iCs w:val="false"/>
-          <w:color w:val="212121"/>
-          <w:sz w:val="20"/>
-          <w:szCs w:val="20"/>
-        </w:rPr>
-        <w:t xml:space="preserve">huit en freelance</w:t>
-      </w:r>
-      <w:r>
-        <w:rPr>
-          <w:rFonts w:ascii="Arial" w:cs="Arial" w:eastAsia="Arial" w:hAnsi="Arial"/>
-          <w:i w:val="false"/>
-          <w:iCs w:val="false"/>
-          <w:color w:val="212121"/>
-          <w:sz w:val="20"/>
-          <w:szCs w:val="20"/>
-        </w:rPr>
-        <w:t xml:space="preserve">. Auparavant, j’ai travaillé neuf années dans l’industrie.</w:t>
+        <w:t xml:space="preserve">Je conçois des </w:t>
+      </w:r>
+      <w:r>
+        <w:rPr>
+          <w:rFonts w:ascii="Arial" w:cs="Arial" w:eastAsia="Arial" w:hAnsi="Arial"/>
+          <w:i w:val="false"/>
+          <w:iCs w:val="false"/>
+          <w:color w:val="212121"/>
+          <w:sz w:val="20"/>
+          <w:szCs w:val="20"/>
+          <w:b/>
+          <w:bCs/>
+        </w:rPr>
+        <w:t xml:space="preserve">sites web</w:t>
+      </w:r>
+      <w:r>
+        <w:rPr>
+          <w:rFonts w:ascii="Arial" w:cs="Arial" w:eastAsia="Arial" w:hAnsi="Arial"/>
+          <w:i w:val="false"/>
+          <w:iCs w:val="false"/>
+          <w:color w:val="212121"/>
+          <w:sz w:val="20"/>
+          <w:szCs w:val="20"/>
+        </w:rPr>
+        <w:t xml:space="preserve">, des </w:t>
+      </w:r>
+      <w:r>
+        <w:rPr>
+          <w:rFonts w:ascii="Arial" w:cs="Arial" w:eastAsia="Arial" w:hAnsi="Arial"/>
+          <w:i w:val="false"/>
+          <w:iCs w:val="false"/>
+          <w:color w:val="212121"/>
+          <w:sz w:val="20"/>
+          <w:szCs w:val="20"/>
+          <w:b/>
+          <w:bCs/>
+        </w:rPr>
+        <w:t xml:space="preserve">applications web</w:t>
+      </w:r>
+      <w:r>
+        <w:rPr>
+          <w:rFonts w:ascii="Arial" w:cs="Arial" w:eastAsia="Arial" w:hAnsi="Arial"/>
+          <w:i w:val="false"/>
+          <w:iCs w:val="false"/>
+          <w:color w:val="212121"/>
+          <w:sz w:val="20"/>
+          <w:szCs w:val="20"/>
+        </w:rPr>
+        <w:t xml:space="preserve">, des </w:t>
+      </w:r>
+      <w:r>
+        <w:rPr>
+          <w:rFonts w:ascii="Arial" w:cs="Arial" w:eastAsia="Arial" w:hAnsi="Arial"/>
+          <w:i w:val="false"/>
+          <w:iCs w:val="false"/>
+          <w:color w:val="212121"/>
+          <w:sz w:val="20"/>
+          <w:szCs w:val="20"/>
+          <w:b/>
+          <w:bCs/>
+        </w:rPr>
+        <w:t xml:space="preserve">plateformes SaaS</w:t>
+      </w:r>
+      <w:r>
+        <w:rPr>
+          <w:rFonts w:ascii="Arial" w:cs="Arial" w:eastAsia="Arial" w:hAnsi="Arial"/>
+          <w:i w:val="false"/>
+          <w:iCs w:val="false"/>
+          <w:color w:val="212121"/>
+          <w:sz w:val="20"/>
+          <w:szCs w:val="20"/>
+        </w:rPr>
+        <w:t xml:space="preserve">, des </w:t>
+      </w:r>
+      <w:r>
+        <w:rPr>
+          <w:rFonts w:ascii="Arial" w:cs="Arial" w:eastAsia="Arial" w:hAnsi="Arial"/>
+          <w:i w:val="false"/>
+          <w:iCs w:val="false"/>
+          <w:color w:val="212121"/>
+          <w:sz w:val="20"/>
+          <w:szCs w:val="20"/>
+          <w:b/>
+          <w:bCs/>
+        </w:rPr>
+        <w:t xml:space="preserve">outils métier</w:t>
+      </w:r>
+      <w:r>
+        <w:rPr>
+          <w:rFonts w:ascii="Arial" w:cs="Arial" w:eastAsia="Arial" w:hAnsi="Arial"/>
+          <w:i w:val="false"/>
+          <w:iCs w:val="false"/>
+          <w:color w:val="212121"/>
+          <w:sz w:val="20"/>
+          <w:szCs w:val="20"/>
+        </w:rPr>
+        <w:t xml:space="preserve"> et des </w:t>
+      </w:r>
+      <w:r>
+        <w:rPr>
+          <w:rFonts w:ascii="Arial" w:cs="Arial" w:eastAsia="Arial" w:hAnsi="Arial"/>
+          <w:i w:val="false"/>
+          <w:iCs w:val="false"/>
+          <w:color w:val="212121"/>
+          <w:sz w:val="20"/>
+          <w:szCs w:val="20"/>
+          <w:b/>
+          <w:bCs/>
+        </w:rPr>
+        <w:t xml:space="preserve">API</w:t>
+      </w:r>
+      <w:r>
+        <w:rPr>
+          <w:rFonts w:ascii="Arial" w:cs="Arial" w:eastAsia="Arial" w:hAnsi="Arial"/>
+          <w:i w:val="false"/>
+          <w:iCs w:val="false"/>
+          <w:color w:val="212121"/>
+          <w:sz w:val="20"/>
+          <w:szCs w:val="20"/>
+        </w:rPr>
+        <w:t xml:space="preserve">. Je reprends aussi les projets existants pour </w:t>
+      </w:r>
+      <w:r>
+        <w:rPr>
+          <w:rFonts w:ascii="Arial" w:cs="Arial" w:eastAsia="Arial" w:hAnsi="Arial"/>
+          <w:i w:val="false"/>
+          <w:iCs w:val="false"/>
+          <w:color w:val="212121"/>
+          <w:sz w:val="20"/>
+          <w:szCs w:val="20"/>
+          <w:b/>
+          <w:bCs/>
+        </w:rPr>
+        <w:t xml:space="preserve">réduire la dette technique</w:t>
+      </w:r>
+      <w:r>
+        <w:rPr>
+          <w:rFonts w:ascii="Arial" w:cs="Arial" w:eastAsia="Arial" w:hAnsi="Arial"/>
+          <w:i w:val="false"/>
+          <w:iCs w:val="false"/>
+          <w:color w:val="212121"/>
+          <w:sz w:val="20"/>
+          <w:szCs w:val="20"/>
+        </w:rPr>
+        <w:t xml:space="preserve">, revoir leur architecture et développer de nouvelles fonctionnalités.</w:t>
       </w:r>
     </w:p>
     <w:p>
@@ -358,56 +468,69 @@
           <w:color w:val="212121"/>
           <w:sz w:val="20"/>
           <w:szCs w:val="20"/>
-        </w:rPr>
-        <w:t xml:space="preserve">J’accompagne les projets </w:t>
-      </w:r>
-      <w:r>
-        <w:rPr>
-          <w:rFonts w:ascii="Arial" w:cs="Arial" w:eastAsia="Arial" w:hAnsi="Arial"/>
-          <w:b/>
-          <w:bCs/>
-          <w:i w:val="false"/>
-          <w:iCs w:val="false"/>
-          <w:color w:val="212121"/>
-          <w:sz w:val="20"/>
-          <w:szCs w:val="20"/>
-        </w:rPr>
-        <w:t xml:space="preserve">sur toute leur durée</w:t>
-      </w:r>
-      <w:r>
-        <w:rPr>
-          <w:rFonts w:ascii="Arial" w:cs="Arial" w:eastAsia="Arial" w:hAnsi="Arial"/>
-          <w:i w:val="false"/>
-          <w:iCs w:val="false"/>
-          <w:color w:val="212121"/>
-          <w:sz w:val="20"/>
-          <w:szCs w:val="20"/>
-        </w:rPr>
-        <w:t xml:space="preserve"> : audit, cadrage, architecture, développement, mise en production, hébergement, maintenance et transmission. J’interviens sur des projets neufs comme sur des applications existantes, notamment pour </w:t>
-      </w:r>
-      <w:r>
-        <w:rPr>
-          <w:rFonts w:ascii="Arial" w:cs="Arial" w:eastAsia="Arial" w:hAnsi="Arial"/>
-          <w:b/>
-          <w:bCs/>
-          <w:i w:val="false"/>
-          <w:iCs w:val="false"/>
-          <w:color w:val="212121"/>
-          <w:sz w:val="20"/>
-          <w:szCs w:val="20"/>
-        </w:rPr>
-        <w:t xml:space="preserve">réduire la dette technique</w:t>
-      </w:r>
-      <w:r>
-        <w:rPr>
-          <w:rFonts w:ascii="Arial" w:cs="Arial" w:eastAsia="Arial" w:hAnsi="Arial"/>
-          <w:i w:val="false"/>
-          <w:iCs w:val="false"/>
-          <w:color w:val="212121"/>
-          <w:sz w:val="20"/>
-          <w:szCs w:val="20"/>
-        </w:rPr>
-        <w:t xml:space="preserve">. Mon périmètre couvre les sites web, l’e-commerce, les applications métier, les SaaS, les dashboards, les ERP, les CRM et les API.</w:t>
+          <w:b/>
+          <w:bCs/>
+        </w:rPr>
+        <w:t xml:space="preserve">Développeur Full Stack senior et lead technique</w:t>
+      </w:r>
+      <w:r>
+        <w:rPr>
+          <w:rFonts w:ascii="Arial" w:cs="Arial" w:eastAsia="Arial" w:hAnsi="Arial"/>
+          <w:i w:val="false"/>
+          <w:iCs w:val="false"/>
+          <w:color w:val="212121"/>
+          <w:sz w:val="20"/>
+          <w:szCs w:val="20"/>
+        </w:rPr>
+        <w:t xml:space="preserve">, j’interviens du </w:t>
+      </w:r>
+      <w:r>
+        <w:rPr>
+          <w:rFonts w:ascii="Arial" w:cs="Arial" w:eastAsia="Arial" w:hAnsi="Arial"/>
+          <w:i w:val="false"/>
+          <w:iCs w:val="false"/>
+          <w:color w:val="212121"/>
+          <w:sz w:val="20"/>
+          <w:szCs w:val="20"/>
+          <w:b/>
+          <w:bCs/>
+        </w:rPr>
+        <w:t xml:space="preserve">cadrage à la mise en production</w:t>
+      </w:r>
+      <w:r>
+        <w:rPr>
+          <w:rFonts w:ascii="Arial" w:cs="Arial" w:eastAsia="Arial" w:hAnsi="Arial"/>
+          <w:i w:val="false"/>
+          <w:iCs w:val="false"/>
+          <w:color w:val="212121"/>
+          <w:sz w:val="20"/>
+          <w:szCs w:val="20"/>
+        </w:rPr>
+        <w:t xml:space="preserve">. J’accompagne les développeurs par les revues de code, le pair programming et la </w:t>
+      </w:r>
+      <w:r>
+        <w:rPr>
+          <w:rFonts w:ascii="Arial" w:cs="Arial" w:eastAsia="Arial" w:hAnsi="Arial"/>
+          <w:i w:val="false"/>
+          <w:iCs w:val="false"/>
+          <w:color w:val="212121"/>
+          <w:sz w:val="20"/>
+          <w:szCs w:val="20"/>
+          <w:b/>
+          <w:bCs/>
+        </w:rPr>
+        <w:t xml:space="preserve">transmission des pratiques</w:t>
+      </w:r>
+      <w:r>
+        <w:rPr>
+          <w:rFonts w:ascii="Arial" w:cs="Arial" w:eastAsia="Arial" w:hAnsi="Arial"/>
+          <w:i w:val="false"/>
+          <w:iCs w:val="false"/>
+          <w:color w:val="212121"/>
+          <w:sz w:val="20"/>
+          <w:szCs w:val="20"/>
+        </w:rPr>
+        <w:t xml:space="preserve">.</w:t>
       </w:r>
     </w:p>
     <w:p>
@@ -424,80 +547,88 @@
           <w:sz w:val="20"/>
           <w:szCs w:val="20"/>
         </w:rPr>
-        <w:t xml:space="preserve">J’ai le </w:t>
-      </w:r>
-      <w:r>
-        <w:rPr>
-          <w:rFonts w:ascii="Arial" w:cs="Arial" w:eastAsia="Arial" w:hAnsi="Arial"/>
-          <w:b/>
-          <w:bCs/>
-          <w:i w:val="false"/>
-          <w:iCs w:val="false"/>
-          <w:color w:val="212121"/>
-          <w:sz w:val="20"/>
-          <w:szCs w:val="20"/>
-        </w:rPr>
-        <w:t xml:space="preserve">goût du travail d’équipe</w:t>
-      </w:r>
-      <w:r>
-        <w:rPr>
-          <w:rFonts w:ascii="Arial" w:cs="Arial" w:eastAsia="Arial" w:hAnsi="Arial"/>
-          <w:i w:val="false"/>
-          <w:iCs w:val="false"/>
-          <w:color w:val="212121"/>
-          <w:sz w:val="20"/>
-          <w:szCs w:val="20"/>
-        </w:rPr>
-        <w:t xml:space="preserve">, et mon parcours le montre : chef d’équipe dans l’industrie, puis </w:t>
-      </w:r>
-      <w:r>
-        <w:rPr>
-          <w:rFonts w:ascii="Arial" w:cs="Arial" w:eastAsia="Arial" w:hAnsi="Arial"/>
-          <w:b/>
-          <w:bCs/>
-          <w:i w:val="false"/>
-          <w:iCs w:val="false"/>
-          <w:color w:val="212121"/>
-          <w:sz w:val="20"/>
-          <w:szCs w:val="20"/>
-        </w:rPr>
-        <w:t xml:space="preserve">lead développeur full stack</w:t>
-      </w:r>
-      <w:r>
-        <w:rPr>
-          <w:rFonts w:ascii="Arial" w:cs="Arial" w:eastAsia="Arial" w:hAnsi="Arial"/>
-          <w:i w:val="false"/>
-          <w:iCs w:val="false"/>
-          <w:color w:val="212121"/>
-          <w:sz w:val="20"/>
-          <w:szCs w:val="20"/>
-        </w:rPr>
-        <w:t xml:space="preserve"> et référent technique au sein d’équipes de développeurs. Je pratique la </w:t>
-      </w:r>
-      <w:r>
-        <w:rPr>
-          <w:rFonts w:ascii="Arial" w:cs="Arial" w:eastAsia="Arial" w:hAnsi="Arial"/>
-          <w:b/>
-          <w:bCs/>
-          <w:i w:val="false"/>
-          <w:iCs w:val="false"/>
-          <w:color w:val="212121"/>
-          <w:sz w:val="20"/>
-          <w:szCs w:val="20"/>
-        </w:rPr>
-        <w:t xml:space="preserve">transmission</w:t>
-      </w:r>
-      <w:r>
-        <w:rPr>
-          <w:rFonts w:ascii="Arial" w:cs="Arial" w:eastAsia="Arial" w:hAnsi="Arial"/>
-          <w:i w:val="false"/>
-          <w:iCs w:val="false"/>
-          <w:color w:val="212121"/>
-          <w:sz w:val="20"/>
-          <w:szCs w:val="20"/>
-        </w:rPr>
-        <w:t xml:space="preserve"> au quotidien, par les revues de code, le pair programming et l’accompagnement des développeurs juniors.</w:t>
-      </w:r>
+        <w:t xml:space="preserve">J’orchestre aussi </w:t>
+      </w:r>
+      <w:r>
+        <w:rPr>
+          <w:rFonts w:ascii="Arial" w:cs="Arial" w:eastAsia="Arial" w:hAnsi="Arial"/>
+          <w:i w:val="false"/>
+          <w:iCs w:val="false"/>
+          <w:color w:val="212121"/>
+          <w:sz w:val="20"/>
+          <w:szCs w:val="20"/>
+          <w:b/>
+          <w:bCs/>
+        </w:rPr>
+        <w:t xml:space="preserve">plusieurs agents IA</w:t>
+      </w:r>
+      <w:r>
+        <w:rPr>
+          <w:rFonts w:ascii="Arial" w:cs="Arial" w:eastAsia="Arial" w:hAnsi="Arial"/>
+          <w:i w:val="false"/>
+          <w:iCs w:val="false"/>
+          <w:color w:val="212121"/>
+          <w:sz w:val="20"/>
+          <w:szCs w:val="20"/>
+        </w:rPr>
+        <w:t xml:space="preserve"> pour concevoir, développer et consolider le code. Je garde la main sur </w:t>
+      </w:r>
+      <w:r>
+        <w:rPr>
+          <w:rFonts w:ascii="Arial" w:cs="Arial" w:eastAsia="Arial" w:hAnsi="Arial"/>
+          <w:i w:val="false"/>
+          <w:iCs w:val="false"/>
+          <w:color w:val="212121"/>
+          <w:sz w:val="20"/>
+          <w:szCs w:val="20"/>
+          <w:b/>
+          <w:bCs/>
+        </w:rPr>
+        <w:t xml:space="preserve">l’architecture et la validation</w:t>
+      </w:r>
+      <w:r>
+        <w:rPr>
+          <w:rFonts w:ascii="Arial" w:cs="Arial" w:eastAsia="Arial" w:hAnsi="Arial"/>
+          <w:i w:val="false"/>
+          <w:iCs w:val="false"/>
+          <w:color w:val="212121"/>
+          <w:sz w:val="20"/>
+          <w:szCs w:val="20"/>
+        </w:rPr>
+        <w:t xml:space="preserve">, et je transforme les bonnes pratiques en </w:t>
+      </w:r>
+      <w:r>
+        <w:rPr>
+          <w:rFonts w:ascii="Arial" w:cs="Arial" w:eastAsia="Arial" w:hAnsi="Arial"/>
+          <w:i w:val="false"/>
+          <w:iCs w:val="false"/>
+          <w:color w:val="212121"/>
+          <w:sz w:val="20"/>
+          <w:szCs w:val="20"/>
+          <w:b/>
+          <w:bCs/>
+        </w:rPr>
+        <w:t xml:space="preserve">contrôles automatisés dans la CI/CD</w:t>
+      </w:r>
+      <w:r>
+        <w:rPr>
+          <w:rFonts w:ascii="Arial" w:cs="Arial" w:eastAsia="Arial" w:hAnsi="Arial"/>
+          <w:i w:val="false"/>
+          <w:iCs w:val="false"/>
+          <w:color w:val="212121"/>
+          <w:sz w:val="20"/>
+          <w:szCs w:val="20"/>
+        </w:rPr>
+        <w:t xml:space="preserve">.</w:t>
+      </w:r>
+    </w:p>
+    <w:p>
+      <w:pPr>
+        <w:spacing w:before="340" w:after="340"/>
+        <w:pBdr>
+          <w:bottom w:val="single" w:sz="4" w:color="D3D1CB"/>
+        </w:pBdr>
+      </w:pPr>
     </w:p>
     <w:p>
       <w:pPr>
@@ -513,127 +644,55 @@
           <w:sz w:val="20"/>
           <w:szCs w:val="20"/>
         </w:rPr>
-        <w:t xml:space="preserve">Je suis </w:t>
-      </w:r>
-      <w:r>
-        <w:rPr>
-          <w:rFonts w:ascii="Arial" w:cs="Arial" w:eastAsia="Arial" w:hAnsi="Arial"/>
-          <w:b/>
-          <w:bCs/>
-          <w:i w:val="false"/>
-          <w:iCs w:val="false"/>
-          <w:color w:val="212121"/>
-          <w:sz w:val="20"/>
-          <w:szCs w:val="20"/>
-        </w:rPr>
-        <w:t xml:space="preserve">freelance depuis 2018</w:t>
-      </w:r>
-      <w:r>
-        <w:rPr>
-          <w:rFonts w:ascii="Arial" w:cs="Arial" w:eastAsia="Arial" w:hAnsi="Arial"/>
-          <w:i w:val="false"/>
-          <w:iCs w:val="false"/>
-          <w:color w:val="212121"/>
-          <w:sz w:val="20"/>
-          <w:szCs w:val="20"/>
-        </w:rPr>
-        <w:t xml:space="preserve">, en alternance entre </w:t>
-      </w:r>
-      <w:r>
-        <w:rPr>
-          <w:rFonts w:ascii="Arial" w:cs="Arial" w:eastAsia="Arial" w:hAnsi="Arial"/>
-          <w:b/>
-          <w:bCs/>
-          <w:i w:val="false"/>
-          <w:iCs w:val="false"/>
-          <w:color w:val="212121"/>
-          <w:sz w:val="20"/>
-          <w:szCs w:val="20"/>
-        </w:rPr>
-        <w:t xml:space="preserve">clients directs</w:t>
-      </w:r>
-      <w:r>
-        <w:rPr>
-          <w:rFonts w:ascii="Arial" w:cs="Arial" w:eastAsia="Arial" w:hAnsi="Arial"/>
-          <w:i w:val="false"/>
-          <w:iCs w:val="false"/>
-          <w:color w:val="212121"/>
-          <w:sz w:val="20"/>
-          <w:szCs w:val="20"/>
-        </w:rPr>
-        <w:t xml:space="preserve"> et </w:t>
-      </w:r>
-      <w:r>
-        <w:rPr>
-          <w:rFonts w:ascii="Arial" w:cs="Arial" w:eastAsia="Arial" w:hAnsi="Arial"/>
-          <w:b/>
-          <w:bCs/>
-          <w:i w:val="false"/>
-          <w:iCs w:val="false"/>
-          <w:color w:val="212121"/>
-          <w:sz w:val="20"/>
-          <w:szCs w:val="20"/>
-        </w:rPr>
-        <w:t xml:space="preserve">missions au sein d’équipes de développement</w:t>
-      </w:r>
-      <w:r>
-        <w:rPr>
-          <w:rFonts w:ascii="Arial" w:cs="Arial" w:eastAsia="Arial" w:hAnsi="Arial"/>
-          <w:i w:val="false"/>
-          <w:iCs w:val="false"/>
-          <w:color w:val="212121"/>
-          <w:sz w:val="20"/>
-          <w:szCs w:val="20"/>
-        </w:rPr>
-        <w:t xml:space="preserve">. Avec les clients directs, je suis l’</w:t>
-      </w:r>
-      <w:r>
-        <w:rPr>
-          <w:rFonts w:ascii="Arial" w:cs="Arial" w:eastAsia="Arial" w:hAnsi="Arial"/>
-          <w:b/>
-          <w:bCs/>
-          <w:i w:val="false"/>
-          <w:iCs w:val="false"/>
-          <w:color w:val="212121"/>
-          <w:sz w:val="20"/>
-          <w:szCs w:val="20"/>
-        </w:rPr>
-        <w:t xml:space="preserve">interlocuteur technique unique</w:t>
-      </w:r>
-      <w:r>
-        <w:rPr>
-          <w:rFonts w:ascii="Arial" w:cs="Arial" w:eastAsia="Arial" w:hAnsi="Arial"/>
-          <w:i w:val="false"/>
-          <w:iCs w:val="false"/>
-          <w:color w:val="212121"/>
-          <w:sz w:val="20"/>
-          <w:szCs w:val="20"/>
-        </w:rPr>
-        <w:t xml:space="preserve">, de l’expression du besoin à l’exploitation : conseil, design, choix techniques et fonctionnels, et relations dans la durée, dans des métiers aussi variés que l’immobilier, le tourisme, la communication ou le recrutement. En parallèle, j’</w:t>
-      </w:r>
-      <w:r>
-        <w:rPr>
-          <w:rFonts w:ascii="Arial" w:cs="Arial" w:eastAsia="Arial" w:hAnsi="Arial"/>
-          <w:b/>
-          <w:bCs/>
-          <w:i w:val="false"/>
-          <w:iCs w:val="false"/>
-          <w:color w:val="212121"/>
-          <w:sz w:val="20"/>
-          <w:szCs w:val="20"/>
-        </w:rPr>
-        <w:t xml:space="preserve">édite mes propres produits</w:t>
-      </w:r>
-      <w:r>
-        <w:rPr>
-          <w:rFonts w:ascii="Arial" w:cs="Arial" w:eastAsia="Arial" w:hAnsi="Arial"/>
-          <w:i w:val="false"/>
-          <w:iCs w:val="false"/>
-          <w:color w:val="212121"/>
-          <w:sz w:val="20"/>
-          <w:szCs w:val="20"/>
-        </w:rPr>
-        <w:t xml:space="preserve">, dont un socle SaaS de gestion de contenu réutilisé d’un client à l’autre.</w:t>
+        <w:t xml:space="preserve">Originaire de Marseille, je suis récemment revenu en France. J’ai </w:t>
+      </w:r>
+      <w:r>
+        <w:rPr>
+          <w:rFonts w:ascii="Arial" w:cs="Arial" w:eastAsia="Arial" w:hAnsi="Arial"/>
+          <w:i w:val="false"/>
+          <w:iCs w:val="false"/>
+          <w:color w:val="212121"/>
+          <w:sz w:val="20"/>
+          <w:szCs w:val="20"/>
+          <w:b/>
+          <w:bCs/>
+        </w:rPr>
+        <w:t xml:space="preserve">plus de quinze ans d’expérience en développement web</w:t>
+      </w:r>
+      <w:r>
+        <w:rPr>
+          <w:rFonts w:ascii="Arial" w:cs="Arial" w:eastAsia="Arial" w:hAnsi="Arial"/>
+          <w:i w:val="false"/>
+          <w:iCs w:val="false"/>
+          <w:color w:val="212121"/>
+          <w:sz w:val="20"/>
+          <w:szCs w:val="20"/>
+        </w:rPr>
+        <w:t xml:space="preserve"> : six ans en France, puis neuf ans et demi au Maroc, dont </w:t>
+      </w:r>
+      <w:r>
+        <w:rPr>
+          <w:rFonts w:ascii="Arial" w:cs="Arial" w:eastAsia="Arial" w:hAnsi="Arial"/>
+          <w:i w:val="false"/>
+          <w:iCs w:val="false"/>
+          <w:color w:val="212121"/>
+          <w:sz w:val="20"/>
+          <w:szCs w:val="20"/>
+          <w:b/>
+          <w:bCs/>
+        </w:rPr>
+        <w:t xml:space="preserve">huit en freelance</w:t>
+      </w:r>
+      <w:r>
+        <w:rPr>
+          <w:rFonts w:ascii="Arial" w:cs="Arial" w:eastAsia="Arial" w:hAnsi="Arial"/>
+          <w:i w:val="false"/>
+          <w:iCs w:val="false"/>
+          <w:color w:val="212121"/>
+          <w:sz w:val="20"/>
+          <w:szCs w:val="20"/>
+        </w:rPr>
+        <w:t xml:space="preserve">.</w:t>
       </w:r>
     </w:p>
     <w:p>
@@ -650,79 +709,55 @@
           <w:sz w:val="20"/>
           <w:szCs w:val="20"/>
         </w:rPr>
-        <w:t xml:space="preserve">Depuis un an, </w:t>
-      </w:r>
-      <w:r>
-        <w:rPr>
-          <w:rFonts w:ascii="Arial" w:cs="Arial" w:eastAsia="Arial" w:hAnsi="Arial"/>
-          <w:b/>
-          <w:bCs/>
-          <w:i w:val="false"/>
-          <w:iCs w:val="false"/>
-          <w:color w:val="212121"/>
-          <w:sz w:val="20"/>
-          <w:szCs w:val="20"/>
-        </w:rPr>
-        <w:t xml:space="preserve">100 % de mon code passe par une orchestration d’agents d’IA</w:t>
-      </w:r>
-      <w:r>
-        <w:rPr>
-          <w:rFonts w:ascii="Arial" w:cs="Arial" w:eastAsia="Arial" w:hAnsi="Arial"/>
-          <w:i w:val="false"/>
-          <w:iCs w:val="false"/>
-          <w:color w:val="212121"/>
-          <w:sz w:val="20"/>
-          <w:szCs w:val="20"/>
-        </w:rPr>
-        <w:t xml:space="preserve">, selon mon propre workflow : concevoir, développer, consolider. Je garde la main sur </w:t>
-      </w:r>
-      <w:r>
-        <w:rPr>
-          <w:rFonts w:ascii="Arial" w:cs="Arial" w:eastAsia="Arial" w:hAnsi="Arial"/>
-          <w:b/>
-          <w:bCs/>
-          <w:i w:val="false"/>
-          <w:iCs w:val="false"/>
-          <w:color w:val="212121"/>
-          <w:sz w:val="20"/>
-          <w:szCs w:val="20"/>
-        </w:rPr>
-        <w:t xml:space="preserve">le cadrage, l’architecture et la revue</w:t>
-      </w:r>
-      <w:r>
-        <w:rPr>
-          <w:rFonts w:ascii="Arial" w:cs="Arial" w:eastAsia="Arial" w:hAnsi="Arial"/>
-          <w:i w:val="false"/>
-          <w:iCs w:val="false"/>
-          <w:color w:val="212121"/>
-          <w:sz w:val="20"/>
-          <w:szCs w:val="20"/>
-        </w:rPr>
-        <w:t xml:space="preserve">, et mes sessions de consolidation transforment les bonnes pratiques en conventions techniques et en </w:t>
-      </w:r>
-      <w:r>
-        <w:rPr>
-          <w:rFonts w:ascii="Arial" w:cs="Arial" w:eastAsia="Arial" w:hAnsi="Arial"/>
-          <w:b/>
-          <w:bCs/>
-          <w:i w:val="false"/>
-          <w:iCs w:val="false"/>
-          <w:color w:val="212121"/>
-          <w:sz w:val="20"/>
-          <w:szCs w:val="20"/>
-        </w:rPr>
-        <w:t xml:space="preserve">garde-fous automatisés dans l’intégration continue</w:t>
-      </w:r>
-      <w:r>
-        <w:rPr>
-          <w:rFonts w:ascii="Arial" w:cs="Arial" w:eastAsia="Arial" w:hAnsi="Arial"/>
-          <w:i w:val="false"/>
-          <w:iCs w:val="false"/>
-          <w:color w:val="212121"/>
-          <w:sz w:val="20"/>
-          <w:szCs w:val="20"/>
-        </w:rPr>
-        <w:t xml:space="preserve">.</w:t>
+        <w:t xml:space="preserve">J’accompagne les projets </w:t>
+      </w:r>
+      <w:r>
+        <w:rPr>
+          <w:rFonts w:ascii="Arial" w:cs="Arial" w:eastAsia="Arial" w:hAnsi="Arial"/>
+          <w:i w:val="false"/>
+          <w:iCs w:val="false"/>
+          <w:color w:val="212121"/>
+          <w:sz w:val="20"/>
+          <w:szCs w:val="20"/>
+          <w:b/>
+          <w:bCs/>
+        </w:rPr>
+        <w:t xml:space="preserve">sur toute leur durée</w:t>
+      </w:r>
+      <w:r>
+        <w:rPr>
+          <w:rFonts w:ascii="Arial" w:cs="Arial" w:eastAsia="Arial" w:hAnsi="Arial"/>
+          <w:i w:val="false"/>
+          <w:iCs w:val="false"/>
+          <w:color w:val="212121"/>
+          <w:sz w:val="20"/>
+          <w:szCs w:val="20"/>
+        </w:rPr>
+        <w:t xml:space="preserve"> : audit, cadrage, architecture, développement, mise en production, hébergement, maintenance et transmission. J’interviens sur des projets neufs comme sur des applications existantes, notamment pour </w:t>
+      </w:r>
+      <w:r>
+        <w:rPr>
+          <w:rFonts w:ascii="Arial" w:cs="Arial" w:eastAsia="Arial" w:hAnsi="Arial"/>
+          <w:i w:val="false"/>
+          <w:iCs w:val="false"/>
+          <w:color w:val="212121"/>
+          <w:sz w:val="20"/>
+          <w:szCs w:val="20"/>
+          <w:b/>
+          <w:bCs/>
+        </w:rPr>
+        <w:t xml:space="preserve">réduire la dette technique</w:t>
+      </w:r>
+      <w:r>
+        <w:rPr>
+          <w:rFonts w:ascii="Arial" w:cs="Arial" w:eastAsia="Arial" w:hAnsi="Arial"/>
+          <w:i w:val="false"/>
+          <w:iCs w:val="false"/>
+          <w:color w:val="212121"/>
+          <w:sz w:val="20"/>
+          <w:szCs w:val="20"/>
+        </w:rPr>
+        <w:t xml:space="preserve">. Mon périmètre couvre les sites web, l’e-commerce, les applications métier, les SaaS, les dashboards, les ERP, les CRM et les API.</w:t>
       </w:r>
     </w:p>
     <w:p>
@@ -739,44 +774,157 @@
           <w:sz w:val="20"/>
           <w:szCs w:val="20"/>
         </w:rPr>
-        <w:t xml:space="preserve">Si vous envisagez, vous aussi, de faire de </w:t>
-      </w:r>
-      <w:r>
-        <w:rPr>
-          <w:rFonts w:ascii="Arial" w:cs="Arial" w:eastAsia="Arial" w:hAnsi="Arial"/>
-          <w:b/>
-          <w:bCs/>
-          <w:i w:val="false"/>
-          <w:iCs w:val="false"/>
-          <w:color w:val="212121"/>
-          <w:sz w:val="20"/>
-          <w:szCs w:val="20"/>
-        </w:rPr>
-        <w:t xml:space="preserve">l’IA un vrai levier de production</w:t>
-      </w:r>
-      <w:r>
-        <w:rPr>
-          <w:rFonts w:ascii="Arial" w:cs="Arial" w:eastAsia="Arial" w:hAnsi="Arial"/>
-          <w:i w:val="false"/>
-          <w:iCs w:val="false"/>
-          <w:color w:val="212121"/>
-          <w:sz w:val="20"/>
-          <w:szCs w:val="20"/>
-        </w:rPr>
-        <w:t xml:space="preserve">, je serais très intéressé de vous accompagner sur ce chemin, </w:t>
-      </w:r>
-      <w:r>
-        <w:rPr>
-          <w:rFonts w:ascii="Arial" w:cs="Arial" w:eastAsia="Arial" w:hAnsi="Arial"/>
-          <w:b/>
-          <w:bCs/>
-          <w:i w:val="false"/>
-          <w:iCs w:val="false"/>
-          <w:color w:val="212121"/>
-          <w:sz w:val="20"/>
-          <w:szCs w:val="20"/>
-        </w:rPr>
-        <w:t xml:space="preserve">sans rien céder sur la qualité du code livré</w:t>
+        <w:t xml:space="preserve">J’ai le </w:t>
+      </w:r>
+      <w:r>
+        <w:rPr>
+          <w:rFonts w:ascii="Arial" w:cs="Arial" w:eastAsia="Arial" w:hAnsi="Arial"/>
+          <w:i w:val="false"/>
+          <w:iCs w:val="false"/>
+          <w:color w:val="212121"/>
+          <w:sz w:val="20"/>
+          <w:szCs w:val="20"/>
+          <w:b/>
+          <w:bCs/>
+        </w:rPr>
+        <w:t xml:space="preserve">goût du travail d’équipe</w:t>
+      </w:r>
+      <w:r>
+        <w:rPr>
+          <w:rFonts w:ascii="Arial" w:cs="Arial" w:eastAsia="Arial" w:hAnsi="Arial"/>
+          <w:i w:val="false"/>
+          <w:iCs w:val="false"/>
+          <w:color w:val="212121"/>
+          <w:sz w:val="20"/>
+          <w:szCs w:val="20"/>
+        </w:rPr>
+        <w:t xml:space="preserve">, et mon parcours le montre : chef d’équipe dans l’industrie, puis </w:t>
+      </w:r>
+      <w:r>
+        <w:rPr>
+          <w:rFonts w:ascii="Arial" w:cs="Arial" w:eastAsia="Arial" w:hAnsi="Arial"/>
+          <w:i w:val="false"/>
+          <w:iCs w:val="false"/>
+          <w:color w:val="212121"/>
+          <w:sz w:val="20"/>
+          <w:szCs w:val="20"/>
+          <w:b/>
+          <w:bCs/>
+        </w:rPr>
+        <w:t xml:space="preserve">lead développeur full stack</w:t>
+      </w:r>
+      <w:r>
+        <w:rPr>
+          <w:rFonts w:ascii="Arial" w:cs="Arial" w:eastAsia="Arial" w:hAnsi="Arial"/>
+          <w:i w:val="false"/>
+          <w:iCs w:val="false"/>
+          <w:color w:val="212121"/>
+          <w:sz w:val="20"/>
+          <w:szCs w:val="20"/>
+        </w:rPr>
+        <w:t xml:space="preserve"> et référent technique au sein d’équipes de développeurs. Je pratique la </w:t>
+      </w:r>
+      <w:r>
+        <w:rPr>
+          <w:rFonts w:ascii="Arial" w:cs="Arial" w:eastAsia="Arial" w:hAnsi="Arial"/>
+          <w:i w:val="false"/>
+          <w:iCs w:val="false"/>
+          <w:color w:val="212121"/>
+          <w:sz w:val="20"/>
+          <w:szCs w:val="20"/>
+          <w:b/>
+          <w:bCs/>
+        </w:rPr>
+        <w:t xml:space="preserve">transmission</w:t>
+      </w:r>
+      <w:r>
+        <w:rPr>
+          <w:rFonts w:ascii="Arial" w:cs="Arial" w:eastAsia="Arial" w:hAnsi="Arial"/>
+          <w:i w:val="false"/>
+          <w:iCs w:val="false"/>
+          <w:color w:val="212121"/>
+          <w:sz w:val="20"/>
+          <w:szCs w:val="20"/>
+        </w:rPr>
+        <w:t xml:space="preserve"> au quotidien, par les revues de code, le pair programming et l’accompagnement des développeurs juniors.</w:t>
+      </w:r>
+    </w:p>
+    <w:p>
+      <w:pPr>
+        <w:spacing w:after="100" w:line="276"/>
+        <w:jc w:val="both"/>
+      </w:pPr>
+      <w:r>
+        <w:rPr>
+          <w:rFonts w:ascii="Arial" w:cs="Arial" w:eastAsia="Arial" w:hAnsi="Arial"/>
+          <w:i w:val="false"/>
+          <w:iCs w:val="false"/>
+          <w:color w:val="212121"/>
+          <w:sz w:val="20"/>
+          <w:szCs w:val="20"/>
+        </w:rPr>
+        <w:t xml:space="preserve">Aujourd’hui, j’</w:t>
+      </w:r>
+      <w:r>
+        <w:rPr>
+          <w:rFonts w:ascii="Arial" w:cs="Arial" w:eastAsia="Arial" w:hAnsi="Arial"/>
+          <w:i w:val="false"/>
+          <w:iCs w:val="false"/>
+          <w:color w:val="212121"/>
+          <w:sz w:val="20"/>
+          <w:szCs w:val="20"/>
+          <w:b/>
+          <w:bCs/>
+        </w:rPr>
+        <w:t xml:space="preserve">orchestre plusieurs agents IA</w:t>
+      </w:r>
+      <w:r>
+        <w:rPr>
+          <w:rFonts w:ascii="Arial" w:cs="Arial" w:eastAsia="Arial" w:hAnsi="Arial"/>
+          <w:i w:val="false"/>
+          <w:iCs w:val="false"/>
+          <w:color w:val="212121"/>
+          <w:sz w:val="20"/>
+          <w:szCs w:val="20"/>
+        </w:rPr>
+        <w:t xml:space="preserve"> selon mon propre workflow : concevoir, développer, consolider. Je garde la main sur </w:t>
+      </w:r>
+      <w:r>
+        <w:rPr>
+          <w:rFonts w:ascii="Arial" w:cs="Arial" w:eastAsia="Arial" w:hAnsi="Arial"/>
+          <w:i w:val="false"/>
+          <w:iCs w:val="false"/>
+          <w:color w:val="212121"/>
+          <w:sz w:val="20"/>
+          <w:szCs w:val="20"/>
+          <w:b/>
+          <w:bCs/>
+        </w:rPr>
+        <w:t xml:space="preserve">le cadrage, l’architecture et la validation</w:t>
+      </w:r>
+      <w:r>
+        <w:rPr>
+          <w:rFonts w:ascii="Arial" w:cs="Arial" w:eastAsia="Arial" w:hAnsi="Arial"/>
+          <w:i w:val="false"/>
+          <w:iCs w:val="false"/>
+          <w:color w:val="212121"/>
+          <w:sz w:val="20"/>
+          <w:szCs w:val="20"/>
+        </w:rPr>
+        <w:t xml:space="preserve">. Mes sessions de consolidation transforment les bonnes pratiques en conventions techniques et en </w:t>
+      </w:r>
+      <w:r>
+        <w:rPr>
+          <w:rFonts w:ascii="Arial" w:cs="Arial" w:eastAsia="Arial" w:hAnsi="Arial"/>
+          <w:i w:val="false"/>
+          <w:iCs w:val="false"/>
+          <w:color w:val="212121"/>
+          <w:sz w:val="20"/>
+          <w:szCs w:val="20"/>
+          <w:b/>
+          <w:bCs/>
+        </w:rPr>
+        <w:t xml:space="preserve">garde-fous automatisés dans la CI/CD</w:t>
       </w:r>
       <w:r>
         <w:rPr>
@@ -16324,7 +16472,7 @@
       </w:r>
     </w:p>
     <w:sectPr>
-      <w:footerReference w:type="default" r:id="rId6"/>
+      <w:footerReference w:type="default" ns2:id="rId6"/>
       <w:pgSz w:w="11906" w:h="16838" w:orient="portrait"/>
       <w:pgMar w:top="1134" w:right="1134" w:bottom="1134" w:left="1134" w:header="708" w:footer="708" w:gutter="0"/>
       <w:pgNumType/>

</xml_diff>

<commit_message>
feat(cv): ajoute github sous linkedin dans le CV et le DCI — task TASK-004
Ajoute les liens de profil aux coordonnées et actualise les exports PDF et Word.

Fichiers:
(+) .tasks/TASK-004-github-cv-dci.md
(M) Johan-REMY-CV.html, Johan-REMY-CV.pdf, index.html
(M) V0-CV-Johan-REMY.html, V0-CV-Johan-REMY.pdf
(M) V1-CV-Johan-REMY.html, V1-CV-Johan-REMY.pdf
(M) Johan-REMY-DCI.html, Johan-REMY-DCI.pdf, Johan-REMY-DCI.docx
</commit_message>
<xml_diff>
--- a/Johan-REMY-DCI.docx
+++ b/Johan-REMY-DCI.docx
@@ -1,6 +1,6 @@
 
 <file path=word/document.xml><?xml version="1.0" encoding="utf-8"?>
-<w:document xmlns:ns1="http://schemas.openxmlformats.org/markup-compatibility/2006" xmlns:ns2="http://schemas.openxmlformats.org/officeDocument/2006/relationships" xmlns:w="http://schemas.openxmlformats.org/wordprocessingml/2006/main" ns1:Ignorable="w14 w15 wp14">
+<w:document xmlns:r="http://schemas.openxmlformats.org/officeDocument/2006/relationships" xmlns:ns1="http://schemas.openxmlformats.org/markup-compatibility/2006" xmlns:ns2="http://schemas.openxmlformats.org/officeDocument/2006/relationships" xmlns:w="http://schemas.openxmlformats.org/wordprocessingml/2006/main" ns1:Ignorable="w14 w15 wp14">
   <w:body>
     <w:p>
       <w:pPr>
@@ -123,6 +123,40 @@
         </w:rPr>
         <w:t xml:space="preserve">VSCode · Codex · Claude Code · Claude Design · GIT worktree</w:t>
       </w:r>
+    </w:p>
+    <w:p>
+      <w:pPr>
+        <w:spacing w:after="20"/>
+      </w:pPr>
+      <w:r>
+        <w:t xml:space="preserve">LinkedIn : </w:t>
+      </w:r>
+      <w:hyperlink r:id="rIdLinkedIn">
+        <w:r>
+          <w:rPr>
+            <w:color w:val="6B7A4A"/>
+            <w:u w:val="single"/>
+          </w:rPr>
+          <w:t>www.linkedin.com/in/johanrm</w:t>
+        </w:r>
+      </w:hyperlink>
+    </w:p>
+    <w:p>
+      <w:pPr>
+        <w:spacing w:after="20"/>
+      </w:pPr>
+      <w:r>
+        <w:t xml:space="preserve">GitHub : </w:t>
+      </w:r>
+      <w:hyperlink r:id="rIdGitHub">
+        <w:r>
+          <w:rPr>
+            <w:color w:val="6B7A4A"/>
+            <w:u w:val="single"/>
+          </w:rPr>
+          <w:t>github.com/johan-Rm</w:t>
+        </w:r>
+      </w:hyperlink>
     </w:p>
     <w:p>
       <w:pPr>

</xml_diff>